<commit_message>
Elektrik raporları: SGK Sicil No + Sözleşme ID firma bloğuna eklendi
FR7.2.38 (Jeneratör) ve FR7.2.71 (Katodik Koruma) config'leri formda
"SGK Sicil No" ve "İSG-KATİP Sözleşme ID" topluyordu ama Word header2.xml
firma bloğunda hedef hücre yoktu → girilen değerler rapora basılmıyordu.

- header2.xml firma bloğuna [SGK Sicil No][değer][Sözleşme ID][değer]
  satırı eklendi (Web/Rapor No satırından sonra)
- scripts/elektrik-firma-satir-ekle.js: tekrar çalıştırılabilir, idempotent
- .docx.bak yedekleri alındı
- İçerik denetimi artık 139 temiz / 0 uyumsuz (önceden 2 uyumsuz)

Co-Authored-By: Claude Opus 4.8 (1M context) <noreply@anthropic.com>
</commit_message>
<xml_diff>
--- a/templates/şablonlar/4. Elektrik/FR7.2.38 Jenaratör Muayene ve Ölçüm Raporu.docx
+++ b/templates/şablonlar/4. Elektrik/FR7.2.38 Jenaratör Muayene ve Ölçüm Raporu.docx
@@ -8056,6 +8056,139 @@
               <w:szCs w:val="16"/>
             </w:rPr>
             <w:t>1</w:t>
+          </w:r>
+        </w:p>
+      </w:tc>
+    </w:tr>
+    <w:tr>
+      <w:tc>
+        <w:tcPr>
+          <w:tcW w:w="1118" w:type="dxa"/>
+          <w:tcBorders>
+            <w:top w:val="nil"/>
+            <w:bottom w:val="single" w:sz="4" w:space="0" w:color="auto"/>
+            <w:right w:val="nil"/>
+          </w:tcBorders>
+          <w:shd w:val="clear" w:color="auto" w:fill="auto"/>
+        </w:tcPr>
+        <w:p>
+          <w:pPr>
+            <w:rPr>
+              <w:rFonts w:ascii="Calibri" w:hAnsi="Calibri" w:cs="Calibri"/>
+              <w:sz w:val="16"/>
+              <w:szCs w:val="16"/>
+            </w:rPr>
+          </w:pPr>
+          <w:r>
+            <w:rPr>
+              <w:rFonts w:ascii="Calibri" w:hAnsi="Calibri" w:cs="Calibri"/>
+              <w:b/>
+              <w:sz w:val="16"/>
+              <w:szCs w:val="16"/>
+              <w:lang w:val="es-ES"/>
+            </w:rPr>
+            <w:t xml:space="preserve">SGK Sicil No      :</w:t>
+          </w:r>
+        </w:p>
+      </w:tc>
+      <w:tc>
+        <w:tcPr>
+          <w:tcW w:w="5875" w:type="dxa"/>
+          <w:tcBorders>
+            <w:top w:val="nil"/>
+            <w:left w:val="nil"/>
+            <w:bottom w:val="single" w:sz="4" w:space="0" w:color="auto"/>
+            <w:right w:val="nil"/>
+          </w:tcBorders>
+        </w:tcPr>
+        <w:p>
+          <w:r>
+            <w:rPr>
+              <w:rFonts w:ascii="Calibri" w:hAnsi="Calibri" w:cs="Calibri"/>
+              <w:sz w:val="16"/>
+              <w:szCs w:val="16"/>
+            </w:rPr>
+            <w:t xml:space="preserve">-</w:t>
+          </w:r>
+        </w:p>
+      </w:tc>
+      <w:tc>
+        <w:tcPr>
+          <w:tcW w:w="1726" w:type="dxa"/>
+          <w:tcBorders>
+            <w:left w:val="nil"/>
+            <w:right w:val="nil"/>
+          </w:tcBorders>
+          <w:shd w:val="clear" w:color="auto" w:fill="auto"/>
+        </w:tcPr>
+        <w:p>
+          <w:pPr>
+            <w:rPr>
+              <w:rFonts w:ascii="Calibri" w:hAnsi="Calibri" w:cs="Calibri"/>
+              <w:sz w:val="16"/>
+              <w:szCs w:val="16"/>
+            </w:rPr>
+          </w:pPr>
+          <w:r>
+            <w:rPr>
+              <w:rFonts w:ascii="Calibri" w:hAnsi="Calibri" w:cs="Calibri"/>
+              <w:b/>
+              <w:sz w:val="16"/>
+              <w:szCs w:val="16"/>
+              <w:lang w:val="es-ES"/>
+            </w:rPr>
+            <w:t xml:space="preserve">İSG-KATİP Sözleşme ID  :</w:t>
+          </w:r>
+        </w:p>
+      </w:tc>
+      <w:tc>
+        <w:tcPr>
+          <w:tcW w:w="1697" w:type="dxa"/>
+          <w:tcBorders>
+            <w:top w:val="nil"/>
+            <w:left w:val="nil"/>
+            <w:bottom w:val="single" w:sz="4" w:space="0" w:color="auto"/>
+          </w:tcBorders>
+        </w:tcPr>
+        <w:p>
+          <w:pPr>
+            <w:rPr>
+              <w:rFonts w:ascii="Calibri" w:hAnsi="Calibri" w:cs="Calibri"/>
+              <w:sz w:val="16"/>
+              <w:szCs w:val="16"/>
+            </w:rPr>
+          </w:pPr>
+          <w:r>
+            <w:rPr>
+              <w:rFonts w:ascii="Calibri" w:hAnsi="Calibri" w:cs="Calibri"/>
+              <w:sz w:val="16"/>
+              <w:szCs w:val="16"/>
+            </w:rPr>
+            <w:t xml:space="preserve">-</w:t>
+          </w:r>
+          <w:r>
+            <w:rPr>
+              <w:rFonts w:ascii="Calibri" w:hAnsi="Calibri" w:cs="Calibri"/>
+              <w:sz w:val="16"/>
+              <w:szCs w:val="16"/>
+            </w:rPr>
+            <w:t/>
+          </w:r>
+          <w:r>
+            <w:rPr>
+              <w:rFonts w:ascii="Calibri" w:hAnsi="Calibri" w:cs="Calibri"/>
+              <w:sz w:val="16"/>
+              <w:szCs w:val="16"/>
+            </w:rPr>
+            <w:t/>
+          </w:r>
+          <w:r>
+            <w:rPr>
+              <w:rFonts w:ascii="Calibri" w:hAnsi="Calibri" w:cs="Calibri"/>
+              <w:sz w:val="16"/>
+              <w:szCs w:val="16"/>
+            </w:rPr>
+            <w:t/>
           </w:r>
         </w:p>
       </w:tc>

</xml_diff>